<commit_message>
CAR Varones: memoria de evacuacion y senalizacion ampliada con imagen y ficha de cada senal
Estructura del ejemplo del usuario (Hogar de Refugio) adaptada al CAR y ampliada:
ambientes por edificacion leidos del plano, peligros, aforo, medios de evacuacion,
organizacion para emergencias, protocolos, simbologia con las senales dibujadas a
norma con placa en braille, fichas por senal y mantenimiento. Las especificaciones
muestran la imagen de cada senal.

Co-Authored-By: Claude Opus 5.5 <noreply@anthropic.com>
Claude-Session: https://claude.ai/code/session_0142t8T16igb3VKxUPwnQPq6
</commit_message>
<xml_diff>
--- a/entregables_varones/ESPECIFICACIONES_TECNICAS_EVACUACION_Y_SENALIZACION_CAR_VARONES.docx
+++ b/entregables_varones/ESPECIFICACIONES_TECNICAS_EVACUACION_Y_SENALIZACION_CAR_VARONES.docx
@@ -3813,6 +3813,52 @@
     </w:p>
     <w:p>
       <w:pPr>
+        <w:spacing w:after="100"/>
+        <w:jc w:val="center"/>
+      </w:pPr>
+      <w:r>
+        <w:drawing>
+          <wp:inline distT="0" distB="0" distL="0" distR="0">
+            <wp:extent cx="1219200" cy="1143000"/>
+            <wp:effectExtent t="0" r="0" b="0" l="0"/>
+            <wp:docPr id="1" name="" descr="" title=""/>
+            <wp:cNvGraphicFramePr>
+              <a:graphicFrameLocks xmlns:a="http://schemas.openxmlformats.org/drawingml/2006/main" noChangeAspect="1"/>
+            </wp:cNvGraphicFramePr>
+            <a:graphic xmlns:a="http://schemas.openxmlformats.org/drawingml/2006/main">
+              <a:graphicData uri="http://schemas.openxmlformats.org/drawingml/2006/picture">
+                <pic:pic xmlns:pic="http://schemas.openxmlformats.org/drawingml/2006/picture">
+                  <pic:nvPicPr>
+                    <pic:cNvPr id="0" name="" descr=""/>
+                    <pic:cNvPicPr>
+                      <a:picLocks noChangeAspect="1" noChangeArrowheads="1"/>
+                    </pic:cNvPicPr>
+                  </pic:nvPicPr>
+                  <pic:blipFill>
+                    <a:blip r:embed="rId10" cstate="none"/>
+                    <a:srcRect/>
+                    <a:stretch>
+                      <a:fillRect/>
+                    </a:stretch>
+                  </pic:blipFill>
+                  <pic:spPr bwMode="auto">
+                    <a:xfrm>
+                      <a:off x="0" y="0"/>
+                      <a:ext cx="1219200" cy="1143000"/>
+                    </a:xfrm>
+                    <a:prstGeom prst="rect">
+                      <a:avLst/>
+                    </a:prstGeom>
+                  </pic:spPr>
+                </pic:pic>
+              </a:graphicData>
+            </a:graphic>
+          </wp:inline>
+        </w:drawing>
+      </w:r>
+    </w:p>
+    <w:p>
+      <w:pPr>
         <w:spacing w:after="100" w:before="0" w:line="276"/>
         <w:jc w:val="both"/>
       </w:pPr>
@@ -4335,6 +4381,52 @@
     </w:p>
     <w:p>
       <w:pPr>
+        <w:spacing w:after="100"/>
+        <w:jc w:val="center"/>
+      </w:pPr>
+      <w:r>
+        <w:drawing>
+          <wp:inline distT="0" distB="0" distL="0" distR="0">
+            <wp:extent cx="962025" cy="1619250"/>
+            <wp:effectExtent t="0" r="0" b="0" l="0"/>
+            <wp:docPr id="1" name="" descr="" title=""/>
+            <wp:cNvGraphicFramePr>
+              <a:graphicFrameLocks xmlns:a="http://schemas.openxmlformats.org/drawingml/2006/main" noChangeAspect="1"/>
+            </wp:cNvGraphicFramePr>
+            <a:graphic xmlns:a="http://schemas.openxmlformats.org/drawingml/2006/main">
+              <a:graphicData uri="http://schemas.openxmlformats.org/drawingml/2006/picture">
+                <pic:pic xmlns:pic="http://schemas.openxmlformats.org/drawingml/2006/picture">
+                  <pic:nvPicPr>
+                    <pic:cNvPr id="0" name="" descr=""/>
+                    <pic:cNvPicPr>
+                      <a:picLocks noChangeAspect="1" noChangeArrowheads="1"/>
+                    </pic:cNvPicPr>
+                  </pic:nvPicPr>
+                  <pic:blipFill>
+                    <a:blip r:embed="rId11" cstate="none"/>
+                    <a:srcRect/>
+                    <a:stretch>
+                      <a:fillRect/>
+                    </a:stretch>
+                  </pic:blipFill>
+                  <pic:spPr bwMode="auto">
+                    <a:xfrm>
+                      <a:off x="0" y="0"/>
+                      <a:ext cx="962025" cy="1619250"/>
+                    </a:xfrm>
+                    <a:prstGeom prst="rect">
+                      <a:avLst/>
+                    </a:prstGeom>
+                  </pic:spPr>
+                </pic:pic>
+              </a:graphicData>
+            </a:graphic>
+          </wp:inline>
+        </w:drawing>
+      </w:r>
+    </w:p>
+    <w:p>
+      <w:pPr>
         <w:spacing w:after="100" w:before="0" w:line="276"/>
         <w:jc w:val="both"/>
       </w:pPr>
@@ -4857,6 +4949,52 @@
     </w:p>
     <w:p>
       <w:pPr>
+        <w:spacing w:after="100"/>
+        <w:jc w:val="center"/>
+      </w:pPr>
+      <w:r>
+        <w:drawing>
+          <wp:inline distT="0" distB="0" distL="0" distR="0">
+            <wp:extent cx="1314450" cy="1143000"/>
+            <wp:effectExtent t="0" r="0" b="0" l="0"/>
+            <wp:docPr id="1" name="" descr="" title=""/>
+            <wp:cNvGraphicFramePr>
+              <a:graphicFrameLocks xmlns:a="http://schemas.openxmlformats.org/drawingml/2006/main" noChangeAspect="1"/>
+            </wp:cNvGraphicFramePr>
+            <a:graphic xmlns:a="http://schemas.openxmlformats.org/drawingml/2006/main">
+              <a:graphicData uri="http://schemas.openxmlformats.org/drawingml/2006/picture">
+                <pic:pic xmlns:pic="http://schemas.openxmlformats.org/drawingml/2006/picture">
+                  <pic:nvPicPr>
+                    <pic:cNvPr id="0" name="" descr=""/>
+                    <pic:cNvPicPr>
+                      <a:picLocks noChangeAspect="1" noChangeArrowheads="1"/>
+                    </pic:cNvPicPr>
+                  </pic:nvPicPr>
+                  <pic:blipFill>
+                    <a:blip r:embed="rId12" cstate="none"/>
+                    <a:srcRect/>
+                    <a:stretch>
+                      <a:fillRect/>
+                    </a:stretch>
+                  </pic:blipFill>
+                  <pic:spPr bwMode="auto">
+                    <a:xfrm>
+                      <a:off x="0" y="0"/>
+                      <a:ext cx="1314450" cy="1143000"/>
+                    </a:xfrm>
+                    <a:prstGeom prst="rect">
+                      <a:avLst/>
+                    </a:prstGeom>
+                  </pic:spPr>
+                </pic:pic>
+              </a:graphicData>
+            </a:graphic>
+          </wp:inline>
+        </w:drawing>
+      </w:r>
+    </w:p>
+    <w:p>
+      <w:pPr>
         <w:spacing w:after="100" w:before="0" w:line="276"/>
         <w:jc w:val="both"/>
       </w:pPr>
@@ -5379,6 +5517,52 @@
     </w:p>
     <w:p>
       <w:pPr>
+        <w:spacing w:after="100"/>
+        <w:jc w:val="center"/>
+      </w:pPr>
+      <w:r>
+        <w:drawing>
+          <wp:inline distT="0" distB="0" distL="0" distR="0">
+            <wp:extent cx="1619250" cy="1619250"/>
+            <wp:effectExtent t="0" r="0" b="0" l="0"/>
+            <wp:docPr id="1" name="" descr="" title=""/>
+            <wp:cNvGraphicFramePr>
+              <a:graphicFrameLocks xmlns:a="http://schemas.openxmlformats.org/drawingml/2006/main" noChangeAspect="1"/>
+            </wp:cNvGraphicFramePr>
+            <a:graphic xmlns:a="http://schemas.openxmlformats.org/drawingml/2006/main">
+              <a:graphicData uri="http://schemas.openxmlformats.org/drawingml/2006/picture">
+                <pic:pic xmlns:pic="http://schemas.openxmlformats.org/drawingml/2006/picture">
+                  <pic:nvPicPr>
+                    <pic:cNvPr id="0" name="" descr=""/>
+                    <pic:cNvPicPr>
+                      <a:picLocks noChangeAspect="1" noChangeArrowheads="1"/>
+                    </pic:cNvPicPr>
+                  </pic:nvPicPr>
+                  <pic:blipFill>
+                    <a:blip r:embed="rId13" cstate="none"/>
+                    <a:srcRect/>
+                    <a:stretch>
+                      <a:fillRect/>
+                    </a:stretch>
+                  </pic:blipFill>
+                  <pic:spPr bwMode="auto">
+                    <a:xfrm>
+                      <a:off x="0" y="0"/>
+                      <a:ext cx="1619250" cy="1619250"/>
+                    </a:xfrm>
+                    <a:prstGeom prst="rect">
+                      <a:avLst/>
+                    </a:prstGeom>
+                  </pic:spPr>
+                </pic:pic>
+              </a:graphicData>
+            </a:graphic>
+          </wp:inline>
+        </w:drawing>
+      </w:r>
+    </w:p>
+    <w:p>
+      <w:pPr>
         <w:spacing w:after="100" w:before="0" w:line="276"/>
         <w:jc w:val="both"/>
       </w:pPr>
@@ -5853,6 +6037,52 @@
     </w:p>
     <w:p>
       <w:pPr>
+        <w:spacing w:after="100"/>
+        <w:jc w:val="center"/>
+      </w:pPr>
+      <w:r>
+        <w:drawing>
+          <wp:inline distT="0" distB="0" distL="0" distR="0">
+            <wp:extent cx="914400" cy="1619250"/>
+            <wp:effectExtent t="0" r="0" b="0" l="0"/>
+            <wp:docPr id="1" name="" descr="" title=""/>
+            <wp:cNvGraphicFramePr>
+              <a:graphicFrameLocks xmlns:a="http://schemas.openxmlformats.org/drawingml/2006/main" noChangeAspect="1"/>
+            </wp:cNvGraphicFramePr>
+            <a:graphic xmlns:a="http://schemas.openxmlformats.org/drawingml/2006/main">
+              <a:graphicData uri="http://schemas.openxmlformats.org/drawingml/2006/picture">
+                <pic:pic xmlns:pic="http://schemas.openxmlformats.org/drawingml/2006/picture">
+                  <pic:nvPicPr>
+                    <pic:cNvPr id="0" name="" descr=""/>
+                    <pic:cNvPicPr>
+                      <a:picLocks noChangeAspect="1" noChangeArrowheads="1"/>
+                    </pic:cNvPicPr>
+                  </pic:nvPicPr>
+                  <pic:blipFill>
+                    <a:blip r:embed="rId14" cstate="none"/>
+                    <a:srcRect/>
+                    <a:stretch>
+                      <a:fillRect/>
+                    </a:stretch>
+                  </pic:blipFill>
+                  <pic:spPr bwMode="auto">
+                    <a:xfrm>
+                      <a:off x="0" y="0"/>
+                      <a:ext cx="914400" cy="1619250"/>
+                    </a:xfrm>
+                    <a:prstGeom prst="rect">
+                      <a:avLst/>
+                    </a:prstGeom>
+                  </pic:spPr>
+                </pic:pic>
+              </a:graphicData>
+            </a:graphic>
+          </wp:inline>
+        </w:drawing>
+      </w:r>
+    </w:p>
+    <w:p>
+      <w:pPr>
         <w:spacing w:after="100" w:before="0" w:line="276"/>
         <w:jc w:val="both"/>
       </w:pPr>
@@ -6375,6 +6605,52 @@
     </w:p>
     <w:p>
       <w:pPr>
+        <w:spacing w:after="100"/>
+        <w:jc w:val="center"/>
+      </w:pPr>
+      <w:r>
+        <w:drawing>
+          <wp:inline distT="0" distB="0" distL="0" distR="0">
+            <wp:extent cx="923925" cy="1619250"/>
+            <wp:effectExtent t="0" r="0" b="0" l="0"/>
+            <wp:docPr id="1" name="" descr="" title=""/>
+            <wp:cNvGraphicFramePr>
+              <a:graphicFrameLocks xmlns:a="http://schemas.openxmlformats.org/drawingml/2006/main" noChangeAspect="1"/>
+            </wp:cNvGraphicFramePr>
+            <a:graphic xmlns:a="http://schemas.openxmlformats.org/drawingml/2006/main">
+              <a:graphicData uri="http://schemas.openxmlformats.org/drawingml/2006/picture">
+                <pic:pic xmlns:pic="http://schemas.openxmlformats.org/drawingml/2006/picture">
+                  <pic:nvPicPr>
+                    <pic:cNvPr id="0" name="" descr=""/>
+                    <pic:cNvPicPr>
+                      <a:picLocks noChangeAspect="1" noChangeArrowheads="1"/>
+                    </pic:cNvPicPr>
+                  </pic:nvPicPr>
+                  <pic:blipFill>
+                    <a:blip r:embed="rId15" cstate="none"/>
+                    <a:srcRect/>
+                    <a:stretch>
+                      <a:fillRect/>
+                    </a:stretch>
+                  </pic:blipFill>
+                  <pic:spPr bwMode="auto">
+                    <a:xfrm>
+                      <a:off x="0" y="0"/>
+                      <a:ext cx="923925" cy="1619250"/>
+                    </a:xfrm>
+                    <a:prstGeom prst="rect">
+                      <a:avLst/>
+                    </a:prstGeom>
+                  </pic:spPr>
+                </pic:pic>
+              </a:graphicData>
+            </a:graphic>
+          </wp:inline>
+        </w:drawing>
+      </w:r>
+    </w:p>
+    <w:p>
+      <w:pPr>
         <w:spacing w:after="100" w:before="0" w:line="276"/>
         <w:jc w:val="both"/>
       </w:pPr>
@@ -6897,6 +7173,52 @@
     </w:p>
     <w:p>
       <w:pPr>
+        <w:spacing w:after="100"/>
+        <w:jc w:val="center"/>
+      </w:pPr>
+      <w:r>
+        <w:drawing>
+          <wp:inline distT="0" distB="0" distL="0" distR="0">
+            <wp:extent cx="952500" cy="1619250"/>
+            <wp:effectExtent t="0" r="0" b="0" l="0"/>
+            <wp:docPr id="1" name="" descr="" title=""/>
+            <wp:cNvGraphicFramePr>
+              <a:graphicFrameLocks xmlns:a="http://schemas.openxmlformats.org/drawingml/2006/main" noChangeAspect="1"/>
+            </wp:cNvGraphicFramePr>
+            <a:graphic xmlns:a="http://schemas.openxmlformats.org/drawingml/2006/main">
+              <a:graphicData uri="http://schemas.openxmlformats.org/drawingml/2006/picture">
+                <pic:pic xmlns:pic="http://schemas.openxmlformats.org/drawingml/2006/picture">
+                  <pic:nvPicPr>
+                    <pic:cNvPr id="0" name="" descr=""/>
+                    <pic:cNvPicPr>
+                      <a:picLocks noChangeAspect="1" noChangeArrowheads="1"/>
+                    </pic:cNvPicPr>
+                  </pic:nvPicPr>
+                  <pic:blipFill>
+                    <a:blip r:embed="rId16" cstate="none"/>
+                    <a:srcRect/>
+                    <a:stretch>
+                      <a:fillRect/>
+                    </a:stretch>
+                  </pic:blipFill>
+                  <pic:spPr bwMode="auto">
+                    <a:xfrm>
+                      <a:off x="0" y="0"/>
+                      <a:ext cx="952500" cy="1619250"/>
+                    </a:xfrm>
+                    <a:prstGeom prst="rect">
+                      <a:avLst/>
+                    </a:prstGeom>
+                  </pic:spPr>
+                </pic:pic>
+              </a:graphicData>
+            </a:graphic>
+          </wp:inline>
+        </w:drawing>
+      </w:r>
+    </w:p>
+    <w:p>
+      <w:pPr>
         <w:spacing w:after="100" w:before="0" w:line="276"/>
         <w:jc w:val="both"/>
       </w:pPr>
@@ -7419,6 +7741,52 @@
     </w:p>
     <w:p>
       <w:pPr>
+        <w:spacing w:after="100"/>
+        <w:jc w:val="center"/>
+      </w:pPr>
+      <w:r>
+        <w:drawing>
+          <wp:inline distT="0" distB="0" distL="0" distR="0">
+            <wp:extent cx="923925" cy="1619250"/>
+            <wp:effectExtent t="0" r="0" b="0" l="0"/>
+            <wp:docPr id="1" name="" descr="" title=""/>
+            <wp:cNvGraphicFramePr>
+              <a:graphicFrameLocks xmlns:a="http://schemas.openxmlformats.org/drawingml/2006/main" noChangeAspect="1"/>
+            </wp:cNvGraphicFramePr>
+            <a:graphic xmlns:a="http://schemas.openxmlformats.org/drawingml/2006/main">
+              <a:graphicData uri="http://schemas.openxmlformats.org/drawingml/2006/picture">
+                <pic:pic xmlns:pic="http://schemas.openxmlformats.org/drawingml/2006/picture">
+                  <pic:nvPicPr>
+                    <pic:cNvPr id="0" name="" descr=""/>
+                    <pic:cNvPicPr>
+                      <a:picLocks noChangeAspect="1" noChangeArrowheads="1"/>
+                    </pic:cNvPicPr>
+                  </pic:nvPicPr>
+                  <pic:blipFill>
+                    <a:blip r:embed="rId17" cstate="none"/>
+                    <a:srcRect/>
+                    <a:stretch>
+                      <a:fillRect/>
+                    </a:stretch>
+                  </pic:blipFill>
+                  <pic:spPr bwMode="auto">
+                    <a:xfrm>
+                      <a:off x="0" y="0"/>
+                      <a:ext cx="923925" cy="1619250"/>
+                    </a:xfrm>
+                    <a:prstGeom prst="rect">
+                      <a:avLst/>
+                    </a:prstGeom>
+                  </pic:spPr>
+                </pic:pic>
+              </a:graphicData>
+            </a:graphic>
+          </wp:inline>
+        </w:drawing>
+      </w:r>
+    </w:p>
+    <w:p>
+      <w:pPr>
         <w:spacing w:after="100" w:before="0" w:line="276"/>
         <w:jc w:val="both"/>
       </w:pPr>
@@ -7941,6 +8309,52 @@
     </w:p>
     <w:p>
       <w:pPr>
+        <w:spacing w:after="100"/>
+        <w:jc w:val="center"/>
+      </w:pPr>
+      <w:r>
+        <w:drawing>
+          <wp:inline distT="0" distB="0" distL="0" distR="0">
+            <wp:extent cx="933450" cy="1619250"/>
+            <wp:effectExtent t="0" r="0" b="0" l="0"/>
+            <wp:docPr id="1" name="" descr="" title=""/>
+            <wp:cNvGraphicFramePr>
+              <a:graphicFrameLocks xmlns:a="http://schemas.openxmlformats.org/drawingml/2006/main" noChangeAspect="1"/>
+            </wp:cNvGraphicFramePr>
+            <a:graphic xmlns:a="http://schemas.openxmlformats.org/drawingml/2006/main">
+              <a:graphicData uri="http://schemas.openxmlformats.org/drawingml/2006/picture">
+                <pic:pic xmlns:pic="http://schemas.openxmlformats.org/drawingml/2006/picture">
+                  <pic:nvPicPr>
+                    <pic:cNvPr id="0" name="" descr=""/>
+                    <pic:cNvPicPr>
+                      <a:picLocks noChangeAspect="1" noChangeArrowheads="1"/>
+                    </pic:cNvPicPr>
+                  </pic:nvPicPr>
+                  <pic:blipFill>
+                    <a:blip r:embed="rId18" cstate="none"/>
+                    <a:srcRect/>
+                    <a:stretch>
+                      <a:fillRect/>
+                    </a:stretch>
+                  </pic:blipFill>
+                  <pic:spPr bwMode="auto">
+                    <a:xfrm>
+                      <a:off x="0" y="0"/>
+                      <a:ext cx="933450" cy="1619250"/>
+                    </a:xfrm>
+                    <a:prstGeom prst="rect">
+                      <a:avLst/>
+                    </a:prstGeom>
+                  </pic:spPr>
+                </pic:pic>
+              </a:graphicData>
+            </a:graphic>
+          </wp:inline>
+        </w:drawing>
+      </w:r>
+    </w:p>
+    <w:p>
+      <w:pPr>
         <w:spacing w:after="100" w:before="0" w:line="276"/>
         <w:jc w:val="both"/>
       </w:pPr>
@@ -8472,6 +8886,52 @@
     </w:p>
     <w:p>
       <w:pPr>
+        <w:spacing w:after="100"/>
+        <w:jc w:val="center"/>
+      </w:pPr>
+      <w:r>
+        <w:drawing>
+          <wp:inline distT="0" distB="0" distL="0" distR="0">
+            <wp:extent cx="933450" cy="1619250"/>
+            <wp:effectExtent t="0" r="0" b="0" l="0"/>
+            <wp:docPr id="1" name="" descr="" title=""/>
+            <wp:cNvGraphicFramePr>
+              <a:graphicFrameLocks xmlns:a="http://schemas.openxmlformats.org/drawingml/2006/main" noChangeAspect="1"/>
+            </wp:cNvGraphicFramePr>
+            <a:graphic xmlns:a="http://schemas.openxmlformats.org/drawingml/2006/main">
+              <a:graphicData uri="http://schemas.openxmlformats.org/drawingml/2006/picture">
+                <pic:pic xmlns:pic="http://schemas.openxmlformats.org/drawingml/2006/picture">
+                  <pic:nvPicPr>
+                    <pic:cNvPr id="0" name="" descr=""/>
+                    <pic:cNvPicPr>
+                      <a:picLocks noChangeAspect="1" noChangeArrowheads="1"/>
+                    </pic:cNvPicPr>
+                  </pic:nvPicPr>
+                  <pic:blipFill>
+                    <a:blip r:embed="rId19" cstate="none"/>
+                    <a:srcRect/>
+                    <a:stretch>
+                      <a:fillRect/>
+                    </a:stretch>
+                  </pic:blipFill>
+                  <pic:spPr bwMode="auto">
+                    <a:xfrm>
+                      <a:off x="0" y="0"/>
+                      <a:ext cx="933450" cy="1619250"/>
+                    </a:xfrm>
+                    <a:prstGeom prst="rect">
+                      <a:avLst/>
+                    </a:prstGeom>
+                  </pic:spPr>
+                </pic:pic>
+              </a:graphicData>
+            </a:graphic>
+          </wp:inline>
+        </w:drawing>
+      </w:r>
+    </w:p>
+    <w:p>
+      <w:pPr>
         <w:spacing w:after="100" w:before="0" w:line="276"/>
         <w:jc w:val="both"/>
       </w:pPr>
@@ -8994,6 +9454,52 @@
     </w:p>
     <w:p>
       <w:pPr>
+        <w:spacing w:after="100"/>
+        <w:jc w:val="center"/>
+      </w:pPr>
+      <w:r>
+        <w:drawing>
+          <wp:inline distT="0" distB="0" distL="0" distR="0">
+            <wp:extent cx="942975" cy="1619250"/>
+            <wp:effectExtent t="0" r="0" b="0" l="0"/>
+            <wp:docPr id="1" name="" descr="" title=""/>
+            <wp:cNvGraphicFramePr>
+              <a:graphicFrameLocks xmlns:a="http://schemas.openxmlformats.org/drawingml/2006/main" noChangeAspect="1"/>
+            </wp:cNvGraphicFramePr>
+            <a:graphic xmlns:a="http://schemas.openxmlformats.org/drawingml/2006/main">
+              <a:graphicData uri="http://schemas.openxmlformats.org/drawingml/2006/picture">
+                <pic:pic xmlns:pic="http://schemas.openxmlformats.org/drawingml/2006/picture">
+                  <pic:nvPicPr>
+                    <pic:cNvPr id="0" name="" descr=""/>
+                    <pic:cNvPicPr>
+                      <a:picLocks noChangeAspect="1" noChangeArrowheads="1"/>
+                    </pic:cNvPicPr>
+                  </pic:nvPicPr>
+                  <pic:blipFill>
+                    <a:blip r:embed="rId20" cstate="none"/>
+                    <a:srcRect/>
+                    <a:stretch>
+                      <a:fillRect/>
+                    </a:stretch>
+                  </pic:blipFill>
+                  <pic:spPr bwMode="auto">
+                    <a:xfrm>
+                      <a:off x="0" y="0"/>
+                      <a:ext cx="942975" cy="1619250"/>
+                    </a:xfrm>
+                    <a:prstGeom prst="rect">
+                      <a:avLst/>
+                    </a:prstGeom>
+                  </pic:spPr>
+                </pic:pic>
+              </a:graphicData>
+            </a:graphic>
+          </wp:inline>
+        </w:drawing>
+      </w:r>
+    </w:p>
+    <w:p>
+      <w:pPr>
         <w:spacing w:after="100" w:before="0" w:line="276"/>
         <w:jc w:val="both"/>
       </w:pPr>
@@ -9516,6 +10022,52 @@
     </w:p>
     <w:p>
       <w:pPr>
+        <w:spacing w:after="100"/>
+        <w:jc w:val="center"/>
+      </w:pPr>
+      <w:r>
+        <w:drawing>
+          <wp:inline distT="0" distB="0" distL="0" distR="0">
+            <wp:extent cx="1323975" cy="1143000"/>
+            <wp:effectExtent t="0" r="0" b="0" l="0"/>
+            <wp:docPr id="1" name="" descr="" title=""/>
+            <wp:cNvGraphicFramePr>
+              <a:graphicFrameLocks xmlns:a="http://schemas.openxmlformats.org/drawingml/2006/main" noChangeAspect="1"/>
+            </wp:cNvGraphicFramePr>
+            <a:graphic xmlns:a="http://schemas.openxmlformats.org/drawingml/2006/main">
+              <a:graphicData uri="http://schemas.openxmlformats.org/drawingml/2006/picture">
+                <pic:pic xmlns:pic="http://schemas.openxmlformats.org/drawingml/2006/picture">
+                  <pic:nvPicPr>
+                    <pic:cNvPr id="0" name="" descr=""/>
+                    <pic:cNvPicPr>
+                      <a:picLocks noChangeAspect="1" noChangeArrowheads="1"/>
+                    </pic:cNvPicPr>
+                  </pic:nvPicPr>
+                  <pic:blipFill>
+                    <a:blip r:embed="rId21" cstate="none"/>
+                    <a:srcRect/>
+                    <a:stretch>
+                      <a:fillRect/>
+                    </a:stretch>
+                  </pic:blipFill>
+                  <pic:spPr bwMode="auto">
+                    <a:xfrm>
+                      <a:off x="0" y="0"/>
+                      <a:ext cx="1323975" cy="1143000"/>
+                    </a:xfrm>
+                    <a:prstGeom prst="rect">
+                      <a:avLst/>
+                    </a:prstGeom>
+                  </pic:spPr>
+                </pic:pic>
+              </a:graphicData>
+            </a:graphic>
+          </wp:inline>
+        </w:drawing>
+      </w:r>
+    </w:p>
+    <w:p>
+      <w:pPr>
         <w:spacing w:after="100" w:before="0" w:line="276"/>
         <w:jc w:val="both"/>
       </w:pPr>
@@ -10047,6 +10599,52 @@
     </w:p>
     <w:p>
       <w:pPr>
+        <w:spacing w:after="100"/>
+        <w:jc w:val="center"/>
+      </w:pPr>
+      <w:r>
+        <w:drawing>
+          <wp:inline distT="0" distB="0" distL="0" distR="0">
+            <wp:extent cx="1343025" cy="1619250"/>
+            <wp:effectExtent t="0" r="0" b="0" l="0"/>
+            <wp:docPr id="1" name="" descr="" title=""/>
+            <wp:cNvGraphicFramePr>
+              <a:graphicFrameLocks xmlns:a="http://schemas.openxmlformats.org/drawingml/2006/main" noChangeAspect="1"/>
+            </wp:cNvGraphicFramePr>
+            <a:graphic xmlns:a="http://schemas.openxmlformats.org/drawingml/2006/main">
+              <a:graphicData uri="http://schemas.openxmlformats.org/drawingml/2006/picture">
+                <pic:pic xmlns:pic="http://schemas.openxmlformats.org/drawingml/2006/picture">
+                  <pic:nvPicPr>
+                    <pic:cNvPr id="0" name="" descr=""/>
+                    <pic:cNvPicPr>
+                      <a:picLocks noChangeAspect="1" noChangeArrowheads="1"/>
+                    </pic:cNvPicPr>
+                  </pic:nvPicPr>
+                  <pic:blipFill>
+                    <a:blip r:embed="rId22" cstate="none"/>
+                    <a:srcRect/>
+                    <a:stretch>
+                      <a:fillRect/>
+                    </a:stretch>
+                  </pic:blipFill>
+                  <pic:spPr bwMode="auto">
+                    <a:xfrm>
+                      <a:off x="0" y="0"/>
+                      <a:ext cx="1343025" cy="1619250"/>
+                    </a:xfrm>
+                    <a:prstGeom prst="rect">
+                      <a:avLst/>
+                    </a:prstGeom>
+                  </pic:spPr>
+                </pic:pic>
+              </a:graphicData>
+            </a:graphic>
+          </wp:inline>
+        </w:drawing>
+      </w:r>
+    </w:p>
+    <w:p>
+      <w:pPr>
         <w:spacing w:after="100" w:before="0" w:line="276"/>
         <w:jc w:val="both"/>
       </w:pPr>
@@ -10569,6 +11167,52 @@
     </w:p>
     <w:p>
       <w:pPr>
+        <w:spacing w:after="100"/>
+        <w:jc w:val="center"/>
+      </w:pPr>
+      <w:r>
+        <w:drawing>
+          <wp:inline distT="0" distB="0" distL="0" distR="0">
+            <wp:extent cx="1276350" cy="1619250"/>
+            <wp:effectExtent t="0" r="0" b="0" l="0"/>
+            <wp:docPr id="1" name="" descr="" title=""/>
+            <wp:cNvGraphicFramePr>
+              <a:graphicFrameLocks xmlns:a="http://schemas.openxmlformats.org/drawingml/2006/main" noChangeAspect="1"/>
+            </wp:cNvGraphicFramePr>
+            <a:graphic xmlns:a="http://schemas.openxmlformats.org/drawingml/2006/main">
+              <a:graphicData uri="http://schemas.openxmlformats.org/drawingml/2006/picture">
+                <pic:pic xmlns:pic="http://schemas.openxmlformats.org/drawingml/2006/picture">
+                  <pic:nvPicPr>
+                    <pic:cNvPr id="0" name="" descr=""/>
+                    <pic:cNvPicPr>
+                      <a:picLocks noChangeAspect="1" noChangeArrowheads="1"/>
+                    </pic:cNvPicPr>
+                  </pic:nvPicPr>
+                  <pic:blipFill>
+                    <a:blip r:embed="rId23" cstate="none"/>
+                    <a:srcRect/>
+                    <a:stretch>
+                      <a:fillRect/>
+                    </a:stretch>
+                  </pic:blipFill>
+                  <pic:spPr bwMode="auto">
+                    <a:xfrm>
+                      <a:off x="0" y="0"/>
+                      <a:ext cx="1276350" cy="1619250"/>
+                    </a:xfrm>
+                    <a:prstGeom prst="rect">
+                      <a:avLst/>
+                    </a:prstGeom>
+                  </pic:spPr>
+                </pic:pic>
+              </a:graphicData>
+            </a:graphic>
+          </wp:inline>
+        </w:drawing>
+      </w:r>
+    </w:p>
+    <w:p>
+      <w:pPr>
         <w:spacing w:after="100" w:before="0" w:line="276"/>
         <w:jc w:val="both"/>
       </w:pPr>
@@ -11091,6 +11735,52 @@
     </w:p>
     <w:p>
       <w:pPr>
+        <w:spacing w:after="100"/>
+        <w:jc w:val="center"/>
+      </w:pPr>
+      <w:r>
+        <w:drawing>
+          <wp:inline distT="0" distB="0" distL="0" distR="0">
+            <wp:extent cx="1295400" cy="1619250"/>
+            <wp:effectExtent t="0" r="0" b="0" l="0"/>
+            <wp:docPr id="1" name="" descr="" title=""/>
+            <wp:cNvGraphicFramePr>
+              <a:graphicFrameLocks xmlns:a="http://schemas.openxmlformats.org/drawingml/2006/main" noChangeAspect="1"/>
+            </wp:cNvGraphicFramePr>
+            <a:graphic xmlns:a="http://schemas.openxmlformats.org/drawingml/2006/main">
+              <a:graphicData uri="http://schemas.openxmlformats.org/drawingml/2006/picture">
+                <pic:pic xmlns:pic="http://schemas.openxmlformats.org/drawingml/2006/picture">
+                  <pic:nvPicPr>
+                    <pic:cNvPr id="0" name="" descr=""/>
+                    <pic:cNvPicPr>
+                      <a:picLocks noChangeAspect="1" noChangeArrowheads="1"/>
+                    </pic:cNvPicPr>
+                  </pic:nvPicPr>
+                  <pic:blipFill>
+                    <a:blip r:embed="rId24" cstate="none"/>
+                    <a:srcRect/>
+                    <a:stretch>
+                      <a:fillRect/>
+                    </a:stretch>
+                  </pic:blipFill>
+                  <pic:spPr bwMode="auto">
+                    <a:xfrm>
+                      <a:off x="0" y="0"/>
+                      <a:ext cx="1295400" cy="1619250"/>
+                    </a:xfrm>
+                    <a:prstGeom prst="rect">
+                      <a:avLst/>
+                    </a:prstGeom>
+                  </pic:spPr>
+                </pic:pic>
+              </a:graphicData>
+            </a:graphic>
+          </wp:inline>
+        </w:drawing>
+      </w:r>
+    </w:p>
+    <w:p>
+      <w:pPr>
         <w:spacing w:after="100" w:before="0" w:line="276"/>
         <w:jc w:val="both"/>
       </w:pPr>
@@ -11613,6 +12303,52 @@
     </w:p>
     <w:p>
       <w:pPr>
+        <w:spacing w:after="100"/>
+        <w:jc w:val="center"/>
+      </w:pPr>
+      <w:r>
+        <w:drawing>
+          <wp:inline distT="0" distB="0" distL="0" distR="0">
+            <wp:extent cx="1295400" cy="1619250"/>
+            <wp:effectExtent t="0" r="0" b="0" l="0"/>
+            <wp:docPr id="1" name="" descr="" title=""/>
+            <wp:cNvGraphicFramePr>
+              <a:graphicFrameLocks xmlns:a="http://schemas.openxmlformats.org/drawingml/2006/main" noChangeAspect="1"/>
+            </wp:cNvGraphicFramePr>
+            <a:graphic xmlns:a="http://schemas.openxmlformats.org/drawingml/2006/main">
+              <a:graphicData uri="http://schemas.openxmlformats.org/drawingml/2006/picture">
+                <pic:pic xmlns:pic="http://schemas.openxmlformats.org/drawingml/2006/picture">
+                  <pic:nvPicPr>
+                    <pic:cNvPr id="0" name="" descr=""/>
+                    <pic:cNvPicPr>
+                      <a:picLocks noChangeAspect="1" noChangeArrowheads="1"/>
+                    </pic:cNvPicPr>
+                  </pic:nvPicPr>
+                  <pic:blipFill>
+                    <a:blip r:embed="rId25" cstate="none"/>
+                    <a:srcRect/>
+                    <a:stretch>
+                      <a:fillRect/>
+                    </a:stretch>
+                  </pic:blipFill>
+                  <pic:spPr bwMode="auto">
+                    <a:xfrm>
+                      <a:off x="0" y="0"/>
+                      <a:ext cx="1295400" cy="1619250"/>
+                    </a:xfrm>
+                    <a:prstGeom prst="rect">
+                      <a:avLst/>
+                    </a:prstGeom>
+                  </pic:spPr>
+                </pic:pic>
+              </a:graphicData>
+            </a:graphic>
+          </wp:inline>
+        </w:drawing>
+      </w:r>
+    </w:p>
+    <w:p>
+      <w:pPr>
         <w:spacing w:after="100" w:before="0" w:line="276"/>
         <w:jc w:val="both"/>
       </w:pPr>
@@ -12135,6 +12871,52 @@
     </w:p>
     <w:p>
       <w:pPr>
+        <w:spacing w:after="100"/>
+        <w:jc w:val="center"/>
+      </w:pPr>
+      <w:r>
+        <w:drawing>
+          <wp:inline distT="0" distB="0" distL="0" distR="0">
+            <wp:extent cx="933450" cy="1619250"/>
+            <wp:effectExtent t="0" r="0" b="0" l="0"/>
+            <wp:docPr id="1" name="" descr="" title=""/>
+            <wp:cNvGraphicFramePr>
+              <a:graphicFrameLocks xmlns:a="http://schemas.openxmlformats.org/drawingml/2006/main" noChangeAspect="1"/>
+            </wp:cNvGraphicFramePr>
+            <a:graphic xmlns:a="http://schemas.openxmlformats.org/drawingml/2006/main">
+              <a:graphicData uri="http://schemas.openxmlformats.org/drawingml/2006/picture">
+                <pic:pic xmlns:pic="http://schemas.openxmlformats.org/drawingml/2006/picture">
+                  <pic:nvPicPr>
+                    <pic:cNvPr id="0" name="" descr=""/>
+                    <pic:cNvPicPr>
+                      <a:picLocks noChangeAspect="1" noChangeArrowheads="1"/>
+                    </pic:cNvPicPr>
+                  </pic:nvPicPr>
+                  <pic:blipFill>
+                    <a:blip r:embed="rId26" cstate="none"/>
+                    <a:srcRect/>
+                    <a:stretch>
+                      <a:fillRect/>
+                    </a:stretch>
+                  </pic:blipFill>
+                  <pic:spPr bwMode="auto">
+                    <a:xfrm>
+                      <a:off x="0" y="0"/>
+                      <a:ext cx="933450" cy="1619250"/>
+                    </a:xfrm>
+                    <a:prstGeom prst="rect">
+                      <a:avLst/>
+                    </a:prstGeom>
+                  </pic:spPr>
+                </pic:pic>
+              </a:graphicData>
+            </a:graphic>
+          </wp:inline>
+        </w:drawing>
+      </w:r>
+    </w:p>
+    <w:p>
+      <w:pPr>
         <w:spacing w:after="100" w:before="0" w:line="276"/>
         <w:jc w:val="both"/>
       </w:pPr>
@@ -12657,6 +13439,52 @@
     </w:p>
     <w:p>
       <w:pPr>
+        <w:spacing w:after="100"/>
+        <w:jc w:val="center"/>
+      </w:pPr>
+      <w:r>
+        <w:drawing>
+          <wp:inline distT="0" distB="0" distL="0" distR="0">
+            <wp:extent cx="1266825" cy="1143000"/>
+            <wp:effectExtent t="0" r="0" b="0" l="0"/>
+            <wp:docPr id="1" name="" descr="" title=""/>
+            <wp:cNvGraphicFramePr>
+              <a:graphicFrameLocks xmlns:a="http://schemas.openxmlformats.org/drawingml/2006/main" noChangeAspect="1"/>
+            </wp:cNvGraphicFramePr>
+            <a:graphic xmlns:a="http://schemas.openxmlformats.org/drawingml/2006/main">
+              <a:graphicData uri="http://schemas.openxmlformats.org/drawingml/2006/picture">
+                <pic:pic xmlns:pic="http://schemas.openxmlformats.org/drawingml/2006/picture">
+                  <pic:nvPicPr>
+                    <pic:cNvPr id="0" name="" descr=""/>
+                    <pic:cNvPicPr>
+                      <a:picLocks noChangeAspect="1" noChangeArrowheads="1"/>
+                    </pic:cNvPicPr>
+                  </pic:nvPicPr>
+                  <pic:blipFill>
+                    <a:blip r:embed="rId27" cstate="none"/>
+                    <a:srcRect/>
+                    <a:stretch>
+                      <a:fillRect/>
+                    </a:stretch>
+                  </pic:blipFill>
+                  <pic:spPr bwMode="auto">
+                    <a:xfrm>
+                      <a:off x="0" y="0"/>
+                      <a:ext cx="1266825" cy="1143000"/>
+                    </a:xfrm>
+                    <a:prstGeom prst="rect">
+                      <a:avLst/>
+                    </a:prstGeom>
+                  </pic:spPr>
+                </pic:pic>
+              </a:graphicData>
+            </a:graphic>
+          </wp:inline>
+        </w:drawing>
+      </w:r>
+    </w:p>
+    <w:p>
+      <w:pPr>
         <w:spacing w:after="100" w:before="0" w:line="276"/>
         <w:jc w:val="both"/>
       </w:pPr>
@@ -13188,6 +14016,52 @@
     </w:p>
     <w:p>
       <w:pPr>
+        <w:spacing w:after="100"/>
+        <w:jc w:val="center"/>
+      </w:pPr>
+      <w:r>
+        <w:drawing>
+          <wp:inline distT="0" distB="0" distL="0" distR="0">
+            <wp:extent cx="1009650" cy="1619250"/>
+            <wp:effectExtent t="0" r="0" b="0" l="0"/>
+            <wp:docPr id="1" name="" descr="" title=""/>
+            <wp:cNvGraphicFramePr>
+              <a:graphicFrameLocks xmlns:a="http://schemas.openxmlformats.org/drawingml/2006/main" noChangeAspect="1"/>
+            </wp:cNvGraphicFramePr>
+            <a:graphic xmlns:a="http://schemas.openxmlformats.org/drawingml/2006/main">
+              <a:graphicData uri="http://schemas.openxmlformats.org/drawingml/2006/picture">
+                <pic:pic xmlns:pic="http://schemas.openxmlformats.org/drawingml/2006/picture">
+                  <pic:nvPicPr>
+                    <pic:cNvPr id="0" name="" descr=""/>
+                    <pic:cNvPicPr>
+                      <a:picLocks noChangeAspect="1" noChangeArrowheads="1"/>
+                    </pic:cNvPicPr>
+                  </pic:nvPicPr>
+                  <pic:blipFill>
+                    <a:blip r:embed="rId28" cstate="none"/>
+                    <a:srcRect/>
+                    <a:stretch>
+                      <a:fillRect/>
+                    </a:stretch>
+                  </pic:blipFill>
+                  <pic:spPr bwMode="auto">
+                    <a:xfrm>
+                      <a:off x="0" y="0"/>
+                      <a:ext cx="1009650" cy="1619250"/>
+                    </a:xfrm>
+                    <a:prstGeom prst="rect">
+                      <a:avLst/>
+                    </a:prstGeom>
+                  </pic:spPr>
+                </pic:pic>
+              </a:graphicData>
+            </a:graphic>
+          </wp:inline>
+        </w:drawing>
+      </w:r>
+    </w:p>
+    <w:p>
+      <w:pPr>
         <w:spacing w:after="100" w:before="0" w:line="276"/>
         <w:jc w:val="both"/>
       </w:pPr>
@@ -13653,6 +14527,52 @@
     </w:p>
     <w:p>
       <w:pPr>
+        <w:spacing w:after="100"/>
+        <w:jc w:val="center"/>
+      </w:pPr>
+      <w:r>
+        <w:drawing>
+          <wp:inline distT="0" distB="0" distL="0" distR="0">
+            <wp:extent cx="1009650" cy="1619250"/>
+            <wp:effectExtent t="0" r="0" b="0" l="0"/>
+            <wp:docPr id="1" name="" descr="" title=""/>
+            <wp:cNvGraphicFramePr>
+              <a:graphicFrameLocks xmlns:a="http://schemas.openxmlformats.org/drawingml/2006/main" noChangeAspect="1"/>
+            </wp:cNvGraphicFramePr>
+            <a:graphic xmlns:a="http://schemas.openxmlformats.org/drawingml/2006/main">
+              <a:graphicData uri="http://schemas.openxmlformats.org/drawingml/2006/picture">
+                <pic:pic xmlns:pic="http://schemas.openxmlformats.org/drawingml/2006/picture">
+                  <pic:nvPicPr>
+                    <pic:cNvPr id="0" name="" descr=""/>
+                    <pic:cNvPicPr>
+                      <a:picLocks noChangeAspect="1" noChangeArrowheads="1"/>
+                    </pic:cNvPicPr>
+                  </pic:nvPicPr>
+                  <pic:blipFill>
+                    <a:blip r:embed="rId29" cstate="none"/>
+                    <a:srcRect/>
+                    <a:stretch>
+                      <a:fillRect/>
+                    </a:stretch>
+                  </pic:blipFill>
+                  <pic:spPr bwMode="auto">
+                    <a:xfrm>
+                      <a:off x="0" y="0"/>
+                      <a:ext cx="1009650" cy="1619250"/>
+                    </a:xfrm>
+                    <a:prstGeom prst="rect">
+                      <a:avLst/>
+                    </a:prstGeom>
+                  </pic:spPr>
+                </pic:pic>
+              </a:graphicData>
+            </a:graphic>
+          </wp:inline>
+        </w:drawing>
+      </w:r>
+    </w:p>
+    <w:p>
+      <w:pPr>
         <w:spacing w:after="100" w:before="0" w:line="276"/>
         <w:jc w:val="both"/>
       </w:pPr>
@@ -14118,6 +15038,52 @@
     </w:p>
     <w:p>
       <w:pPr>
+        <w:spacing w:after="100"/>
+        <w:jc w:val="center"/>
+      </w:pPr>
+      <w:r>
+        <w:drawing>
+          <wp:inline distT="0" distB="0" distL="0" distR="0">
+            <wp:extent cx="1628775" cy="1143000"/>
+            <wp:effectExtent t="0" r="0" b="0" l="0"/>
+            <wp:docPr id="1" name="" descr="" title=""/>
+            <wp:cNvGraphicFramePr>
+              <a:graphicFrameLocks xmlns:a="http://schemas.openxmlformats.org/drawingml/2006/main" noChangeAspect="1"/>
+            </wp:cNvGraphicFramePr>
+            <a:graphic xmlns:a="http://schemas.openxmlformats.org/drawingml/2006/main">
+              <a:graphicData uri="http://schemas.openxmlformats.org/drawingml/2006/picture">
+                <pic:pic xmlns:pic="http://schemas.openxmlformats.org/drawingml/2006/picture">
+                  <pic:nvPicPr>
+                    <pic:cNvPr id="0" name="" descr=""/>
+                    <pic:cNvPicPr>
+                      <a:picLocks noChangeAspect="1" noChangeArrowheads="1"/>
+                    </pic:cNvPicPr>
+                  </pic:nvPicPr>
+                  <pic:blipFill>
+                    <a:blip r:embed="rId30" cstate="none"/>
+                    <a:srcRect/>
+                    <a:stretch>
+                      <a:fillRect/>
+                    </a:stretch>
+                  </pic:blipFill>
+                  <pic:spPr bwMode="auto">
+                    <a:xfrm>
+                      <a:off x="0" y="0"/>
+                      <a:ext cx="1628775" cy="1143000"/>
+                    </a:xfrm>
+                    <a:prstGeom prst="rect">
+                      <a:avLst/>
+                    </a:prstGeom>
+                  </pic:spPr>
+                </pic:pic>
+              </a:graphicData>
+            </a:graphic>
+          </wp:inline>
+        </w:drawing>
+      </w:r>
+    </w:p>
+    <w:p>
+      <w:pPr>
         <w:spacing w:after="100" w:before="0" w:line="276"/>
         <w:jc w:val="both"/>
       </w:pPr>
@@ -14560,6 +15526,52 @@
           <w:szCs w:val="19"/>
         </w:rPr>
         <w:t xml:space="preserve">DESCRIPCIÓN</w:t>
+      </w:r>
+    </w:p>
+    <w:p>
+      <w:pPr>
+        <w:spacing w:after="100"/>
+        <w:jc w:val="center"/>
+      </w:pPr>
+      <w:r>
+        <w:drawing>
+          <wp:inline distT="0" distB="0" distL="0" distR="0">
+            <wp:extent cx="1619250" cy="1619250"/>
+            <wp:effectExtent t="0" r="0" b="0" l="0"/>
+            <wp:docPr id="1" name="" descr="" title=""/>
+            <wp:cNvGraphicFramePr>
+              <a:graphicFrameLocks xmlns:a="http://schemas.openxmlformats.org/drawingml/2006/main" noChangeAspect="1"/>
+            </wp:cNvGraphicFramePr>
+            <a:graphic xmlns:a="http://schemas.openxmlformats.org/drawingml/2006/main">
+              <a:graphicData uri="http://schemas.openxmlformats.org/drawingml/2006/picture">
+                <pic:pic xmlns:pic="http://schemas.openxmlformats.org/drawingml/2006/picture">
+                  <pic:nvPicPr>
+                    <pic:cNvPr id="0" name="" descr=""/>
+                    <pic:cNvPicPr>
+                      <a:picLocks noChangeAspect="1" noChangeArrowheads="1"/>
+                    </pic:cNvPicPr>
+                  </pic:nvPicPr>
+                  <pic:blipFill>
+                    <a:blip r:embed="rId31" cstate="none"/>
+                    <a:srcRect/>
+                    <a:stretch>
+                      <a:fillRect/>
+                    </a:stretch>
+                  </pic:blipFill>
+                  <pic:spPr bwMode="auto">
+                    <a:xfrm>
+                      <a:off x="0" y="0"/>
+                      <a:ext cx="1619250" cy="1619250"/>
+                    </a:xfrm>
+                    <a:prstGeom prst="rect">
+                      <a:avLst/>
+                    </a:prstGeom>
+                  </pic:spPr>
+                </pic:pic>
+              </a:graphicData>
+            </a:graphic>
+          </wp:inline>
+        </w:drawing>
       </w:r>
     </w:p>
     <w:p>

</xml_diff>